<commit_message>
ADD reset passw. ADD language check. ADD LAB21 folder. ADD marketing ideas
</commit_message>
<xml_diff>
--- a/legal/Cookie_Policy_EN.docx
+++ b/legal/Cookie_Policy_EN.docx
@@ -42,7 +42,7 @@
           <w:sz w:val="20"/>
           <w:szCs w:val="20"/>
         </w:rPr>
-        <w:t xml:space="preserve">Last updated: 17 July 2026</w:t>
+        <w:t xml:space="preserve">Last updated: 21 July 2026 · Version 2.0</w:t>
       </w:r>
     </w:p>
     <w:p>
@@ -55,6 +55,54 @@
     </w:p>
     <w:p>
       <w:pPr>
+        <w:pStyle w:val="Heading2"/>
+        <w:spacing w:after="100" w:before="220"/>
+      </w:pPr>
+      <w:r>
+        <w:t xml:space="preserve">At a glance</w:t>
+      </w:r>
+    </w:p>
+    <w:p>
+      <w:pPr>
+        <w:pStyle w:val="ListParagraph"/>
+        <w:numPr>
+          <w:ilvl w:val="0"/>
+          <w:numId w:val="2"/>
+        </w:numPr>
+        <w:spacing w:after="80" w:line="300"/>
+      </w:pPr>
+      <w:r>
+        <w:t xml:space="preserve">We use strictly necessary cookies without consent, and analytics/marketing cookies only if you consent.</w:t>
+      </w:r>
+    </w:p>
+    <w:p>
+      <w:pPr>
+        <w:pStyle w:val="ListParagraph"/>
+        <w:numPr>
+          <w:ilvl w:val="0"/>
+          <w:numId w:val="2"/>
+        </w:numPr>
+        <w:spacing w:after="80" w:line="300"/>
+      </w:pPr>
+      <w:r>
+        <w:t xml:space="preserve">You can change your mind any time via the "Cookie preferences" link in the footer.</w:t>
+      </w:r>
+    </w:p>
+    <w:p>
+      <w:pPr>
+        <w:pStyle w:val="ListParagraph"/>
+        <w:numPr>
+          <w:ilvl w:val="0"/>
+          <w:numId w:val="2"/>
+        </w:numPr>
+        <w:spacing w:after="80" w:line="300"/>
+      </w:pPr>
+      <w:r>
+        <w:t xml:space="preserve">We record your choices as proof of consent.</w:t>
+      </w:r>
+    </w:p>
+    <w:p>
+      <w:pPr>
         <w:spacing w:after="140" w:line="300"/>
         <w:jc w:val="both"/>
       </w:pPr>
@@ -79,7 +127,26 @@
         <w:t xml:space="preserve">Controller</w:t>
       </w:r>
       <w:r>
-        <w:t xml:space="preserve">") uses cookies and similar technologies (local storage, pixels, SDKs) on the TrainMind AI website and applications, in accordance with the GDPR, the Italian ePrivacy rules (Art. 122, Legislative Decree 196/2003) and the Italian Data Protection Authority’s Guidelines on cookies of 10 June 2021.</w:t>
+        <w:t xml:space="preserve">") uses cookies and similar technologies (local storage, pixels, SDKs) on the TrainMind AI website and applications, in accordance with the GDPR, Art. 122 of Italian Legislative Decree 196/2003 and the Italian DPA's Guidelines on cookies of 10 June 2021.</w:t>
+      </w:r>
+    </w:p>
+    <w:p>
+      <w:pPr>
+        <w:spacing w:after="140" w:line="300"/>
+        <w:jc w:val="both"/>
+      </w:pPr>
+      <w:r>
+        <w:t xml:space="preserve">The Italian version is the </w:t>
+      </w:r>
+      <w:r>
+        <w:rPr>
+          <w:b/>
+          <w:bCs/>
+        </w:rPr>
+        <w:t xml:space="preserve">controlling version</w:t>
+      </w:r>
+      <w:r>
+        <w:t xml:space="preserve"> and prevails over any translation in case of discrepancy.</w:t>
       </w:r>
     </w:p>
     <w:p>
@@ -97,7 +164,7 @@
         <w:jc w:val="both"/>
       </w:pPr>
       <w:r>
-        <w:t xml:space="preserve">Cookies are small text files that websites place on your device to store information. Similar technologies (such as localStorage or tracking pixels) serve comparable purposes; this Policy covers them all under the term "cookies".</w:t>
+        <w:t xml:space="preserve">Cookies are small text files that websites place on your device. Similar technologies (such as localStorage or tracking pixels) serve comparable purposes; this Policy covers them all under the term "cookies".</w:t>
       </w:r>
     </w:p>
     <w:p>
@@ -231,7 +298,7 @@
                 <w:sz w:val="19"/>
                 <w:szCs w:val="19"/>
               </w:rPr>
-              <w:t xml:space="preserve">Technical / strictly necessary</w:t>
+              <w:t xml:space="preserve">Strictly necessary</w:t>
             </w:r>
           </w:p>
         </w:tc>
@@ -256,7 +323,7 @@
                 <w:sz w:val="19"/>
                 <w:szCs w:val="19"/>
               </w:rPr>
-              <w:t xml:space="preserve">Authentication, session management, security, load balancing, saving preferences (e.g. language, cookie choices). The Service cannot function without them.</w:t>
+              <w:t xml:space="preserve">Authentication, session management, security, load balancing, saving essential preferences (e.g. language, cookie choices). The Service cannot function without them.</w:t>
             </w:r>
           </w:p>
         </w:tc>
@@ -281,7 +348,7 @@
                 <w:sz w:val="19"/>
                 <w:szCs w:val="19"/>
               </w:rPr>
-              <w:t xml:space="preserve">No consent required (legitimate interest / contract)</w:t>
+              <w:t xml:space="preserve">No consent required (Art. 122 D.lgs. 196/2003)</w:t>
             </w:r>
           </w:p>
         </w:tc>
@@ -410,7 +477,7 @@
                 <w:sz w:val="19"/>
                 <w:szCs w:val="19"/>
               </w:rPr>
-              <w:t xml:space="preserve">Building user profiles and delivering personalised advertising, retargeting and social media features (e.g. Meta Pixel, Google Ads, social embeds).</w:t>
+              <w:t xml:space="preserve">Building user profiles and delivering personalised advertising, retargeting and social features (e.g. Meta Pixel, Google Ads, social embeds).</w:t>
             </w:r>
           </w:p>
         </w:tc>
@@ -452,17 +519,7 @@
         <w:jc w:val="both"/>
       </w:pPr>
       <w:r>
-        <w:t xml:space="preserve">The detailed, always up-to-date list of individual cookies (name, provider, duration, purpose) is available in the cookie banner/preference centre of the Service. </w:t>
-      </w:r>
-      <w:r>
-        <w:rPr>
-          <w:b/>
-          <w:bCs/>
-        </w:rPr>
-        <w:t xml:space="preserve">[Insert or link the cookie table generated by your consent management platform.]</w:t>
-      </w:r>
-      <w:r>
-        <w:t xml:space="preserve"/>
+        <w:t xml:space="preserve">The detailed, always up-to-date list of individual cookies (name, provider, duration, purpose) is available in the cookie banner/preference centre of the Service.</w:t>
       </w:r>
     </w:p>
     <w:p>
@@ -480,7 +537,37 @@
         <w:jc w:val="both"/>
       </w:pPr>
       <w:r>
-        <w:t xml:space="preserve">On your first visit, a banner allows you to: accept all cookies; reject all non-technical cookies; or customise your choices by category. No non-technical cookie is set before consent. Your choice is stored and can be changed at any time via the </w:t>
+        <w:t xml:space="preserve">On your first visit, a banner lets you: </w:t>
+      </w:r>
+      <w:r>
+        <w:rPr>
+          <w:b/>
+          <w:bCs/>
+        </w:rPr>
+        <w:t xml:space="preserve">accept all</w:t>
+      </w:r>
+      <w:r>
+        <w:t xml:space="preserve"> cookies; </w:t>
+      </w:r>
+      <w:r>
+        <w:rPr>
+          <w:b/>
+          <w:bCs/>
+        </w:rPr>
+        <w:t xml:space="preserve">reject all</w:t>
+      </w:r>
+      <w:r>
+        <w:t xml:space="preserve"> non-technical cookies; or </w:t>
+      </w:r>
+      <w:r>
+        <w:rPr>
+          <w:b/>
+          <w:bCs/>
+        </w:rPr>
+        <w:t xml:space="preserve">customise</w:t>
+      </w:r>
+      <w:r>
+        <w:t xml:space="preserve"> your choices by category. No non-technical cookie is set before consent. Your choice is stored and can be changed any time via the </w:t>
       </w:r>
       <w:r>
         <w:rPr>
@@ -509,7 +596,17 @@
         <w:t xml:space="preserve">recorded as proof of consent</w:t>
       </w:r>
       <w:r>
-        <w:t xml:space="preserve"> (Art. 7(1) GDPR). In line with the Italian DPA’s Guidelines, the banner is not shown again for at least 6 months after your choice, unless the conditions of processing change significantly, it is impossible to know whether a choice was already made (e.g. cookies deleted), or you reopen the preference centre yourself.</w:t>
+        <w:t xml:space="preserve"> (Art. 7(1) GDPR). In line with the Italian DPA's Guidelines, the banner is not shown again for at least </w:t>
+      </w:r>
+      <w:r>
+        <w:rPr>
+          <w:b/>
+          <w:bCs/>
+        </w:rPr>
+        <w:t xml:space="preserve">6 months</w:t>
+      </w:r>
+      <w:r>
+        <w:t xml:space="preserve"> after your choice, unless the conditions of processing change significantly, it is impossible to know whether a choice was already made (e.g. cookies deleted), or you reopen the preference centre yourself.</w:t>
       </w:r>
     </w:p>
     <w:p>
@@ -527,7 +624,7 @@
         <w:jc w:val="both"/>
       </w:pPr>
       <w:r>
-        <w:t xml:space="preserve">Some cookies are set by third parties acting as autonomous controllers or processors (e.g. Google, Meta). We do not control their processing; please refer to their privacy policies. Where third parties are established outside the EEA, transfers occur under the safeguards described in our Privacy Policy.</w:t>
+        <w:t xml:space="preserve">Some cookies are set by third parties acting as autonomous controllers or processors (e.g. Google, Meta). We do not control their processing; please refer to their privacy policies. Where third parties are established outside the EEA, transfers occur under the safeguards described in our Privacy Policy (DPF, SCC).</w:t>
       </w:r>
     </w:p>
     <w:p>
@@ -545,7 +642,7 @@
         <w:jc w:val="both"/>
       </w:pPr>
       <w:r>
-        <w:t xml:space="preserve">You can also block or delete cookies through your browser settings (Chrome, Firefox, Safari, Edge). Blocking technical cookies may prevent the Service from working properly. Instructions are available in your browser’s help pages.</w:t>
+        <w:t xml:space="preserve">You can also block or delete cookies through your browser settings (Chrome, Firefox, Safari, Edge). Blocking technical cookies may prevent the Service from working properly. Instructions are available in your browser's help pages.</w:t>
       </w:r>
     </w:p>
     <w:p>
@@ -784,6 +881,12 @@
   </w:abstractNum>
   <w:num w:numId="1">
     <w:abstractNumId w:val="1"/>
+    <w:lvlOverride w:ilvl="0">
+      <w:startOverride w:val="1"/>
+    </w:lvlOverride>
+  </w:num>
+  <w:num w:numId="2">
+    <w:abstractNumId w:val="2"/>
     <w:lvlOverride w:ilvl="0">
       <w:startOverride w:val="1"/>
     </w:lvlOverride>

</xml_diff>